<commit_message>
[LOGIC] Generated Unit-tests for NotesController, uppon my first manually implemented Test-File "TodoListControllerTests". (Noch moi so vü Zeilen schreiben und mei Hond würd obfoin)
</commit_message>
<xml_diff>
--- a/0_Documents/Projektstatusbericht_3.docx
+++ b/0_Documents/Projektstatusbericht_3.docx
@@ -139,21 +139,12 @@
             <w:pPr>
               <w:spacing w:before="60" w:after="60"/>
             </w:pPr>
-            <w:proofErr w:type="spellStart"/>
             <w:r>
               <w:rPr>
                 <w:b/>
                 <w:bCs/>
               </w:rPr>
-              <w:t>ProjektmanagerIn</w:t>
-            </w:r>
-            <w:proofErr w:type="spellEnd"/>
-            <w:r>
-              <w:rPr>
-                <w:b/>
-                <w:bCs/>
-              </w:rPr>
-              <w:t>:</w:t>
+              <w:t>ProjektmanagerIn:</w:t>
             </w:r>
           </w:p>
         </w:tc>
@@ -577,23 +568,13 @@
               <w:spacing w:before="60" w:after="60"/>
             </w:pPr>
             <w:r>
-              <w:t xml:space="preserve">Die App in ihrer Grundform steht bereit und ist nutzbar. Es sind noch einige Bugs zu beheben und Testläufe durchzuführen. Ebenso fehlen noch ThemeProvider, Das </w:t>
-            </w:r>
-            <w:proofErr w:type="spellStart"/>
-            <w:r>
-              <w:t>Theme</w:t>
-            </w:r>
-            <w:proofErr w:type="spellEnd"/>
-            <w:r>
-              <w:t xml:space="preserve"> als Style selbst, Account-Lösch-Funktion (Datenschutz) oder </w:t>
-            </w:r>
-            <w:proofErr w:type="spellStart"/>
-            <w:r>
-              <w:t>zb</w:t>
-            </w:r>
-            <w:proofErr w:type="spellEnd"/>
-            <w:r>
-              <w:t xml:space="preserve">. </w:t>
+              <w:t xml:space="preserve">Die App in ihrer Grundform steht bereit und ist nutzbar. Es sind noch einige Bugs zu beheben und Testläufe durchzuführen. Ebenso fehlen noch ThemeProvider, Das Theme als Style selbst, Account-Lösch-Funktion (Datenschutz) </w:t>
+            </w:r>
+            <w:r>
+              <w:t>oder auch die restlichen Unit-Tests.</w:t>
+            </w:r>
+            <w:r>
+              <w:t xml:space="preserve"> </w:t>
             </w:r>
           </w:p>
         </w:tc>
@@ -693,31 +674,7 @@
               <w:spacing w:before="60" w:after="60"/>
             </w:pPr>
             <w:r>
-              <w:t>FlatDB-</w:t>
-            </w:r>
-            <w:proofErr w:type="spellStart"/>
-            <w:r>
-              <w:t>to</w:t>
-            </w:r>
-            <w:proofErr w:type="spellEnd"/>
-            <w:r>
-              <w:t xml:space="preserve">-Nodes </w:t>
-            </w:r>
-            <w:proofErr w:type="spellStart"/>
-            <w:r>
-              <w:t>conversion</w:t>
-            </w:r>
-            <w:proofErr w:type="spellEnd"/>
-            <w:r>
-              <w:t xml:space="preserve"> für </w:t>
-            </w:r>
-            <w:proofErr w:type="spellStart"/>
-            <w:r>
-              <w:t>FileBrowser</w:t>
-            </w:r>
-            <w:proofErr w:type="spellEnd"/>
-            <w:r>
-              <w:t xml:space="preserve"> implementiert.</w:t>
+              <w:t>FlatDB-to-Nodes conversion für FileBrowser implementiert.</w:t>
             </w:r>
           </w:p>
           <w:p>
@@ -818,7 +775,10 @@
               <w:spacing w:before="60" w:after="60"/>
             </w:pPr>
             <w:r>
-              <w:t>Triggers müssen noch überlegt werden für die Datenbank -&gt; Was kann</w:t>
+              <w:t>Triggers müssen noch überlegt werden für die Datenbank -&gt; W</w:t>
+            </w:r>
+            <w:r>
+              <w:t xml:space="preserve">elche Trigger wären sinnvoll? </w:t>
             </w:r>
           </w:p>
         </w:tc>
@@ -903,6 +863,18 @@
             </w:pPr>
             <w:r>
               <w:t>Test-Projekt für API anlegen und Unit-Tests schreiben</w:t>
+            </w:r>
+          </w:p>
+          <w:p>
+            <w:pPr>
+              <w:numPr>
+                <w:ilvl w:val="0"/>
+                <w:numId w:val="3"/>
+              </w:numPr>
+              <w:spacing w:before="60" w:after="60"/>
+            </w:pPr>
+            <w:r>
+              <w:t>Berechtigungen prüfen</w:t>
             </w:r>
           </w:p>
           <w:p>

</xml_diff>